<commit_message>
Updated spec and datasheets
</commit_message>
<xml_diff>
--- a/DeskHub1A System Spec 1.0.docx
+++ b/DeskHub1A System Spec 1.0.docx
@@ -20,13 +20,8 @@
       <w:pPr>
         <w:pStyle w:val="Title"/>
       </w:pPr>
-      <w:proofErr w:type="spellStart"/>
-      <w:r>
-        <w:t>DeskHub</w:t>
-      </w:r>
-      <w:proofErr w:type="spellEnd"/>
-      <w:r>
-        <w:t xml:space="preserve"> 1A</w:t>
+      <w:r>
+        <w:t>DeskHub 1A</w:t>
       </w:r>
     </w:p>
     <w:p>
@@ -229,6 +224,12 @@
     <w:bookmarkStart w:id="0" w:name="_Toc236262381" w:displacedByCustomXml="next"/>
     <w:sdt>
       <w:sdtPr>
+        <w:rPr>
+          <w:b w:val="0"/>
+          <w:bCs w:val="0"/>
+          <w:sz w:val="24"/>
+          <w:szCs w:val="24"/>
+        </w:rPr>
         <w:id w:val="-1204634262"/>
         <w:docPartObj>
           <w:docPartGallery w:val="Table of Contents"/>
@@ -238,8 +239,6 @@
       <w:sdtEndPr>
         <w:rPr>
           <w:noProof/>
-          <w:sz w:val="24"/>
-          <w:szCs w:val="24"/>
         </w:rPr>
       </w:sdtEndPr>
       <w:sdtContent>
@@ -668,15 +667,7 @@
         </w:numPr>
       </w:pPr>
       <w:r>
-        <w:t>Rotary Encoder with Press (</w:t>
-      </w:r>
-      <w:proofErr w:type="spellStart"/>
-      <w:r>
-        <w:t>Fan+Light</w:t>
-      </w:r>
-      <w:proofErr w:type="spellEnd"/>
-      <w:r>
-        <w:t>)</w:t>
+        <w:t>Rotary Encoder with Press (Fan+Light)</w:t>
       </w:r>
     </w:p>
     <w:p>
@@ -777,15 +768,7 @@
         </w:numPr>
       </w:pPr>
       <w:r>
-        <w:t xml:space="preserve">1v15 </w:t>
-      </w:r>
-      <w:proofErr w:type="spellStart"/>
-      <w:r>
-        <w:t>VCore</w:t>
-      </w:r>
-      <w:proofErr w:type="spellEnd"/>
-      <w:r>
-        <w:t xml:space="preserve"> Reg for USB7206</w:t>
+        <w:t>1v15 VCore Reg for USB7206</w:t>
       </w:r>
     </w:p>
     <w:p>
@@ -1383,7 +1366,6 @@
         <w:tc>
           <w:tcPr>
             <w:tcW w:w="2851" w:type="dxa"/>
-            <w:hideMark/>
           </w:tcPr>
           <w:p>
             <w:pPr>
@@ -1394,22 +1376,11 @@
                 <w:highlight w:val="yellow"/>
               </w:rPr>
             </w:pPr>
-            <w:r>
-              <w:rPr>
-                <w:b/>
-                <w:bCs/>
-                <w:sz w:val="20"/>
-                <w:szCs w:val="20"/>
-                <w:highlight w:val="yellow"/>
-              </w:rPr>
-              <w:t>TI LMR33630</w:t>
-            </w:r>
           </w:p>
         </w:tc>
         <w:tc>
           <w:tcPr>
             <w:tcW w:w="0" w:type="auto"/>
-            <w:hideMark/>
           </w:tcPr>
           <w:p>
             <w:pPr>
@@ -1426,7 +1397,7 @@
                 <w:szCs w:val="20"/>
                 <w:highlight w:val="yellow"/>
               </w:rPr>
-              <w:t>Primary 12 V → 5 V buck. Final choice depends on current budget.</w:t>
+              <w:t>Size for 5V ~&lt;15A</w:t>
             </w:r>
           </w:p>
         </w:tc>
@@ -2165,30 +2136,8 @@
         <w:rPr>
           <w:highlight w:val="yellow"/>
         </w:rPr>
-        <w:t xml:space="preserve">Current </w:t>
-      </w:r>
-      <w:proofErr w:type="spellStart"/>
-      <w:r>
-        <w:rPr>
-          <w:highlight w:val="yellow"/>
-        </w:rPr>
-        <w:t>req</w:t>
-      </w:r>
-      <w:proofErr w:type="spellEnd"/>
-      <w:r>
-        <w:rPr>
-          <w:highlight w:val="yellow"/>
-        </w:rPr>
-        <w:t xml:space="preserve"> </w:t>
-      </w:r>
-      <w:proofErr w:type="spellStart"/>
-      <w:r>
-        <w:rPr>
-          <w:highlight w:val="yellow"/>
-        </w:rPr>
-        <w:t>tbd</w:t>
-      </w:r>
-      <w:proofErr w:type="spellEnd"/>
+        <w:t>Current req tbd</w:t>
+      </w:r>
     </w:p>
     <w:p>
       <w:r>
@@ -2211,59 +2160,6 @@
     </w:p>
     <w:p>
       <w:r>
-        <w:t>Reasons</w:t>
-      </w:r>
-    </w:p>
-    <w:p>
-      <w:pPr>
-        <w:pStyle w:val="ListParagraph"/>
-        <w:numPr>
-          <w:ilvl w:val="0"/>
-          <w:numId w:val="9"/>
-        </w:numPr>
-      </w:pPr>
-      <w:r>
-        <w:t xml:space="preserve">Excellent documentation </w:t>
-      </w:r>
-    </w:p>
-    <w:p>
-      <w:pPr>
-        <w:pStyle w:val="ListParagraph"/>
-        <w:numPr>
-          <w:ilvl w:val="0"/>
-          <w:numId w:val="9"/>
-        </w:numPr>
-      </w:pPr>
-      <w:r>
-        <w:t xml:space="preserve">Reference design </w:t>
-      </w:r>
-    </w:p>
-    <w:p>
-      <w:pPr>
-        <w:pStyle w:val="ListParagraph"/>
-        <w:numPr>
-          <w:ilvl w:val="0"/>
-          <w:numId w:val="9"/>
-        </w:numPr>
-      </w:pPr>
-      <w:r>
-        <w:t xml:space="preserve">Six downstream ports </w:t>
-      </w:r>
-    </w:p>
-    <w:p>
-      <w:pPr>
-        <w:pStyle w:val="ListParagraph"/>
-        <w:numPr>
-          <w:ilvl w:val="0"/>
-          <w:numId w:val="9"/>
-        </w:numPr>
-      </w:pPr>
-      <w:r>
-        <w:t xml:space="preserve">Future expansion </w:t>
-      </w:r>
-    </w:p>
-    <w:p>
-      <w:r>
         <w:t>Configuration</w:t>
       </w:r>
     </w:p>
@@ -2280,7 +2176,7 @@
     <w:p>
       <w:r>
         <w:pict w14:anchorId="07BF1BA0">
-          <v:rect id="_x0000_i1285" style="width:0;height:1.5pt" o:hralign="center" o:hrstd="t" o:hr="t" fillcolor="#a0a0a0" stroked="f"/>
+          <v:rect id="_x0000_i1025" style="width:0;height:1.5pt" o:hralign="center" o:hrstd="t" o:hr="t" fillcolor="#a0a0a0" stroked="f"/>
         </w:pict>
       </w:r>
     </w:p>
@@ -2513,7 +2409,7 @@
     <w:p>
       <w:r>
         <w:pict w14:anchorId="499388E4">
-          <v:rect id="_x0000_i1286" style="width:0;height:1.5pt" o:hralign="center" o:hrstd="t" o:hr="t" fillcolor="#a0a0a0" stroked="f"/>
+          <v:rect id="_x0000_i1026" style="width:0;height:1.5pt" o:hralign="center" o:hrstd="t" o:hr="t" fillcolor="#a0a0a0" stroked="f"/>
         </w:pict>
       </w:r>
     </w:p>
@@ -2559,7 +2455,7 @@
     <w:p>
       <w:r>
         <w:pict w14:anchorId="3BF75C69">
-          <v:rect id="_x0000_i1287" style="width:0;height:1.5pt" o:hralign="center" o:hrstd="t" o:hr="t" fillcolor="#a0a0a0" stroked="f"/>
+          <v:rect id="_x0000_i1027" style="width:0;height:1.5pt" o:hralign="center" o:hrstd="t" o:hr="t" fillcolor="#a0a0a0" stroked="f"/>
         </w:pict>
       </w:r>
     </w:p>
@@ -2575,8 +2471,744 @@
     </w:p>
     <w:p>
       <w:r>
+        <w:t>4-pin PWM PC fan</w:t>
+      </w:r>
+    </w:p>
+    <w:p>
+      <w:r>
+        <w:t>Signals</w:t>
+      </w:r>
+    </w:p>
+    <w:p>
+      <w:pPr>
+        <w:pStyle w:val="ListParagraph"/>
+        <w:numPr>
+          <w:ilvl w:val="0"/>
+          <w:numId w:val="11"/>
+        </w:numPr>
+      </w:pPr>
+      <w:r>
+        <w:t xml:space="preserve">PWM </w:t>
+      </w:r>
+    </w:p>
+    <w:p>
+      <w:pPr>
+        <w:pStyle w:val="ListParagraph"/>
+        <w:numPr>
+          <w:ilvl w:val="0"/>
+          <w:numId w:val="11"/>
+        </w:numPr>
+      </w:pPr>
+      <w:r>
+        <w:t xml:space="preserve">Tachometer </w:t>
+      </w:r>
+    </w:p>
+    <w:p>
+      <w:r>
+        <w:t>Future MCU controls speed.</w:t>
+      </w:r>
+    </w:p>
+    <w:p>
+      <w:r>
         <w:lastRenderedPageBreak/>
-        <w:t>4-pin PWM PC fan</w:t>
+        <w:pict w14:anchorId="1BA0E9DC">
+          <v:rect id="_x0000_i1028" style="width:0;height:1.5pt" o:hralign="center" o:hrstd="t" o:hr="t" fillcolor="#a0a0a0" stroked="f"/>
+        </w:pict>
+      </w:r>
+    </w:p>
+    <w:p>
+      <w:r>
+        <w:t>8. Future MCU</w:t>
+      </w:r>
+    </w:p>
+    <w:p>
+      <w:r>
+        <w:t>No MCU selected.</w:t>
+      </w:r>
+    </w:p>
+    <w:p>
+      <w:r>
+        <w:t>Provide:</w:t>
+      </w:r>
+    </w:p>
+    <w:p>
+      <w:pPr>
+        <w:pStyle w:val="ListParagraph"/>
+        <w:numPr>
+          <w:ilvl w:val="0"/>
+          <w:numId w:val="12"/>
+        </w:numPr>
+      </w:pPr>
+      <w:r>
+        <w:t xml:space="preserve">Footprint area </w:t>
+      </w:r>
+    </w:p>
+    <w:p>
+      <w:pPr>
+        <w:pStyle w:val="ListParagraph"/>
+        <w:numPr>
+          <w:ilvl w:val="0"/>
+          <w:numId w:val="12"/>
+        </w:numPr>
+      </w:pPr>
+      <w:r>
+        <w:t xml:space="preserve">SWD </w:t>
+      </w:r>
+    </w:p>
+    <w:p>
+      <w:pPr>
+        <w:pStyle w:val="ListParagraph"/>
+        <w:numPr>
+          <w:ilvl w:val="0"/>
+          <w:numId w:val="12"/>
+        </w:numPr>
+      </w:pPr>
+      <w:r>
+        <w:t xml:space="preserve">UART </w:t>
+      </w:r>
+    </w:p>
+    <w:p>
+      <w:pPr>
+        <w:pStyle w:val="ListParagraph"/>
+        <w:numPr>
+          <w:ilvl w:val="0"/>
+          <w:numId w:val="12"/>
+        </w:numPr>
+      </w:pPr>
+      <w:r>
+        <w:t xml:space="preserve">GPIO </w:t>
+      </w:r>
+    </w:p>
+    <w:p>
+      <w:pPr>
+        <w:pStyle w:val="ListParagraph"/>
+        <w:numPr>
+          <w:ilvl w:val="0"/>
+          <w:numId w:val="12"/>
+        </w:numPr>
+      </w:pPr>
+      <w:r>
+        <w:t xml:space="preserve">I²C </w:t>
+      </w:r>
+    </w:p>
+    <w:p>
+      <w:pPr>
+        <w:pStyle w:val="ListParagraph"/>
+        <w:numPr>
+          <w:ilvl w:val="0"/>
+          <w:numId w:val="12"/>
+        </w:numPr>
+      </w:pPr>
+      <w:r>
+        <w:t xml:space="preserve">ADC inputs </w:t>
+      </w:r>
+    </w:p>
+    <w:p>
+      <w:r>
+        <w:t>Connections</w:t>
+      </w:r>
+    </w:p>
+    <w:p>
+      <w:pPr>
+        <w:pStyle w:val="ListParagraph"/>
+        <w:numPr>
+          <w:ilvl w:val="0"/>
+          <w:numId w:val="13"/>
+        </w:numPr>
+      </w:pPr>
+      <w:r>
+        <w:t xml:space="preserve">Fan PWM </w:t>
+      </w:r>
+    </w:p>
+    <w:p>
+      <w:pPr>
+        <w:pStyle w:val="ListParagraph"/>
+        <w:numPr>
+          <w:ilvl w:val="0"/>
+          <w:numId w:val="13"/>
+        </w:numPr>
+      </w:pPr>
+      <w:r>
+        <w:t xml:space="preserve">Fan Tach </w:t>
+      </w:r>
+    </w:p>
+    <w:p>
+      <w:pPr>
+        <w:pStyle w:val="ListParagraph"/>
+        <w:numPr>
+          <w:ilvl w:val="0"/>
+          <w:numId w:val="13"/>
+        </w:numPr>
+      </w:pPr>
+      <w:r>
+        <w:t xml:space="preserve">Temperature </w:t>
+      </w:r>
+    </w:p>
+    <w:p>
+      <w:pPr>
+        <w:pStyle w:val="ListParagraph"/>
+        <w:numPr>
+          <w:ilvl w:val="0"/>
+          <w:numId w:val="13"/>
+        </w:numPr>
+      </w:pPr>
+      <w:r>
+        <w:t xml:space="preserve">Current sensors </w:t>
+      </w:r>
+    </w:p>
+    <w:p>
+      <w:pPr>
+        <w:pStyle w:val="ListParagraph"/>
+        <w:numPr>
+          <w:ilvl w:val="0"/>
+          <w:numId w:val="13"/>
+        </w:numPr>
+      </w:pPr>
+      <w:r>
+        <w:t xml:space="preserve">LEDs </w:t>
+      </w:r>
+    </w:p>
+    <w:p>
+      <w:pPr>
+        <w:pStyle w:val="ListParagraph"/>
+        <w:numPr>
+          <w:ilvl w:val="0"/>
+          <w:numId w:val="13"/>
+        </w:numPr>
+      </w:pPr>
+      <w:r>
+        <w:t xml:space="preserve">Hub reset </w:t>
+      </w:r>
+    </w:p>
+    <w:p>
+      <w:r>
+        <w:pict w14:anchorId="07385BDE">
+          <v:rect id="_x0000_i1029" style="width:0;height:1.5pt" o:hralign="center" o:hrstd="t" o:hr="t" fillcolor="#a0a0a0" stroked="f"/>
+        </w:pict>
+      </w:r>
+    </w:p>
+    <w:p>
+      <w:r>
+        <w:t>9. LEDs</w:t>
+      </w:r>
+    </w:p>
+    <w:p>
+      <w:r>
+        <w:t>Populate footprints for</w:t>
+      </w:r>
+    </w:p>
+    <w:p>
+      <w:r>
+        <w:t>Mandatory</w:t>
+      </w:r>
+    </w:p>
+    <w:p>
+      <w:pPr>
+        <w:pStyle w:val="ListParagraph"/>
+        <w:numPr>
+          <w:ilvl w:val="0"/>
+          <w:numId w:val="14"/>
+        </w:numPr>
+      </w:pPr>
+      <w:r>
+        <w:t xml:space="preserve">Power </w:t>
+      </w:r>
+    </w:p>
+    <w:p>
+      <w:pPr>
+        <w:pStyle w:val="ListParagraph"/>
+        <w:numPr>
+          <w:ilvl w:val="0"/>
+          <w:numId w:val="14"/>
+        </w:numPr>
+      </w:pPr>
+      <w:r>
+        <w:t xml:space="preserve">Hub Active </w:t>
+      </w:r>
+    </w:p>
+    <w:p>
+      <w:r>
+        <w:t>Optional</w:t>
+      </w:r>
+    </w:p>
+    <w:p>
+      <w:pPr>
+        <w:pStyle w:val="ListParagraph"/>
+        <w:numPr>
+          <w:ilvl w:val="0"/>
+          <w:numId w:val="15"/>
+        </w:numPr>
+      </w:pPr>
+      <w:r>
+        <w:t xml:space="preserve">Front Port Activity ×2 </w:t>
+      </w:r>
+    </w:p>
+    <w:p>
+      <w:pPr>
+        <w:pStyle w:val="ListParagraph"/>
+        <w:numPr>
+          <w:ilvl w:val="0"/>
+          <w:numId w:val="15"/>
+        </w:numPr>
+      </w:pPr>
+      <w:r>
+        <w:t xml:space="preserve">Rear Port Activity </w:t>
+      </w:r>
+    </w:p>
+    <w:p>
+      <w:pPr>
+        <w:pStyle w:val="ListParagraph"/>
+        <w:numPr>
+          <w:ilvl w:val="0"/>
+          <w:numId w:val="15"/>
+        </w:numPr>
+      </w:pPr>
+      <w:r>
+        <w:t xml:space="preserve">SD Activity </w:t>
+      </w:r>
+    </w:p>
+    <w:p>
+      <w:pPr>
+        <w:pStyle w:val="ListParagraph"/>
+        <w:numPr>
+          <w:ilvl w:val="0"/>
+          <w:numId w:val="15"/>
+        </w:numPr>
+      </w:pPr>
+      <w:r>
+        <w:t xml:space="preserve">Overcurrent indicators </w:t>
+      </w:r>
+    </w:p>
+    <w:p>
+      <w:pPr>
+        <w:pStyle w:val="ListParagraph"/>
+        <w:numPr>
+          <w:ilvl w:val="0"/>
+          <w:numId w:val="15"/>
+        </w:numPr>
+      </w:pPr>
+      <w:r>
+        <w:t xml:space="preserve">MCU status </w:t>
+      </w:r>
+    </w:p>
+    <w:p>
+      <w:r>
+        <w:pict w14:anchorId="1828F6F1">
+          <v:rect id="_x0000_i1030" style="width:0;height:1.5pt" o:hralign="center" o:hrstd="t" o:hr="t" fillcolor="#a0a0a0" stroked="f"/>
+        </w:pict>
+      </w:r>
+    </w:p>
+    <w:p>
+      <w:r>
+        <w:t>10. Temperature Monitoring</w:t>
+      </w:r>
+    </w:p>
+    <w:p>
+      <w:r>
+        <w:t>Provide footprint for</w:t>
+      </w:r>
+    </w:p>
+    <w:p>
+      <w:r>
+        <w:t>Digital temperature sensor</w:t>
+      </w:r>
+    </w:p>
+    <w:p>
+      <w:r>
+        <w:t>or</w:t>
+      </w:r>
+    </w:p>
+    <w:p>
+      <w:r>
+        <w:lastRenderedPageBreak/>
+        <w:t>NTC thermistor</w:t>
+      </w:r>
+    </w:p>
+    <w:p>
+      <w:r>
+        <w:t>Located near</w:t>
+      </w:r>
+    </w:p>
+    <w:p>
+      <w:pPr>
+        <w:pStyle w:val="ListParagraph"/>
+        <w:numPr>
+          <w:ilvl w:val="0"/>
+          <w:numId w:val="16"/>
+        </w:numPr>
+      </w:pPr>
+      <w:r>
+        <w:t xml:space="preserve">Buck regulator </w:t>
+      </w:r>
+    </w:p>
+    <w:p>
+      <w:pPr>
+        <w:pStyle w:val="ListParagraph"/>
+        <w:numPr>
+          <w:ilvl w:val="0"/>
+          <w:numId w:val="16"/>
+        </w:numPr>
+      </w:pPr>
+      <w:r>
+        <w:t xml:space="preserve">Hub controller </w:t>
+      </w:r>
+    </w:p>
+    <w:p>
+      <w:r>
+        <w:pict w14:anchorId="7696443A">
+          <v:rect id="_x0000_i1031" style="width:0;height:1.5pt" o:hralign="center" o:hrstd="t" o:hr="t" fillcolor="#a0a0a0" stroked="f"/>
+        </w:pict>
+      </w:r>
+    </w:p>
+    <w:p>
+      <w:r>
+        <w:t>11. Protection</w:t>
+      </w:r>
+    </w:p>
+    <w:p>
+      <w:r>
+        <w:t>Every external connector receives ESD protection.</w:t>
+      </w:r>
+    </w:p>
+    <w:p>
+      <w:r>
+        <w:t>Protected interfaces</w:t>
+      </w:r>
+    </w:p>
+    <w:p>
+      <w:pPr>
+        <w:pStyle w:val="ListParagraph"/>
+        <w:numPr>
+          <w:ilvl w:val="0"/>
+          <w:numId w:val="17"/>
+        </w:numPr>
+      </w:pPr>
+      <w:r>
+        <w:t xml:space="preserve">USB-C ×4 </w:t>
+      </w:r>
+    </w:p>
+    <w:p>
+      <w:pPr>
+        <w:pStyle w:val="ListParagraph"/>
+        <w:numPr>
+          <w:ilvl w:val="0"/>
+          <w:numId w:val="17"/>
+        </w:numPr>
+      </w:pPr>
+      <w:r>
+        <w:t xml:space="preserve">SD </w:t>
+      </w:r>
+    </w:p>
+    <w:p>
+      <w:pPr>
+        <w:pStyle w:val="ListParagraph"/>
+        <w:numPr>
+          <w:ilvl w:val="0"/>
+          <w:numId w:val="17"/>
+        </w:numPr>
+      </w:pPr>
+      <w:r>
+        <w:t xml:space="preserve">microSD </w:t>
+      </w:r>
+    </w:p>
+    <w:p>
+      <w:pPr>
+        <w:pStyle w:val="ListParagraph"/>
+        <w:numPr>
+          <w:ilvl w:val="0"/>
+          <w:numId w:val="17"/>
+        </w:numPr>
+      </w:pPr>
+      <w:r>
+        <w:t xml:space="preserve">Barrel Jack </w:t>
+      </w:r>
+    </w:p>
+    <w:p>
+      <w:r>
+        <w:pict w14:anchorId="7DC46C9D">
+          <v:rect id="_x0000_i1032" style="width:0;height:1.5pt" o:hralign="center" o:hrstd="t" o:hr="t" fillcolor="#a0a0a0" stroked="f"/>
+        </w:pict>
+      </w:r>
+    </w:p>
+    <w:p>
+      <w:r>
+        <w:t>12. Internal Expansion</w:t>
+      </w:r>
+    </w:p>
+    <w:p>
+      <w:r>
+        <w:t>Provide</w:t>
+      </w:r>
+    </w:p>
+    <w:p>
+      <w:pPr>
+        <w:pStyle w:val="ListParagraph"/>
+        <w:numPr>
+          <w:ilvl w:val="0"/>
+          <w:numId w:val="18"/>
+        </w:numPr>
+      </w:pPr>
+      <w:r>
+        <w:t xml:space="preserve">Internal USB Header </w:t>
+      </w:r>
+    </w:p>
+    <w:p>
+      <w:pPr>
+        <w:pStyle w:val="ListParagraph"/>
+        <w:numPr>
+          <w:ilvl w:val="0"/>
+          <w:numId w:val="18"/>
+        </w:numPr>
+      </w:pPr>
+      <w:r>
+        <w:t xml:space="preserve">12 V Header </w:t>
+      </w:r>
+    </w:p>
+    <w:p>
+      <w:pPr>
+        <w:pStyle w:val="ListParagraph"/>
+        <w:numPr>
+          <w:ilvl w:val="0"/>
+          <w:numId w:val="18"/>
+        </w:numPr>
+      </w:pPr>
+      <w:r>
+        <w:t xml:space="preserve">I²C Header </w:t>
+      </w:r>
+    </w:p>
+    <w:p>
+      <w:pPr>
+        <w:pStyle w:val="ListParagraph"/>
+        <w:numPr>
+          <w:ilvl w:val="0"/>
+          <w:numId w:val="18"/>
+        </w:numPr>
+      </w:pPr>
+      <w:r>
+        <w:t xml:space="preserve">UART Header </w:t>
+      </w:r>
+    </w:p>
+    <w:p>
+      <w:pPr>
+        <w:pStyle w:val="ListParagraph"/>
+        <w:numPr>
+          <w:ilvl w:val="0"/>
+          <w:numId w:val="18"/>
+        </w:numPr>
+      </w:pPr>
+      <w:r>
+        <w:t xml:space="preserve">GPIO Header </w:t>
+      </w:r>
+    </w:p>
+    <w:p>
+      <w:r>
+        <w:pict w14:anchorId="7387B380">
+          <v:rect id="_x0000_i1033" style="width:0;height:1.5pt" o:hralign="center" o:hrstd="t" o:hr="t" fillcolor="#a0a0a0" stroked="f"/>
+        </w:pict>
+      </w:r>
+    </w:p>
+    <w:p>
+      <w:r>
+        <w:t>13. Debug</w:t>
+      </w:r>
+    </w:p>
+    <w:p>
+      <w:r>
+        <w:t>Provide</w:t>
+      </w:r>
+    </w:p>
+    <w:p>
+      <w:pPr>
+        <w:pStyle w:val="ListParagraph"/>
+        <w:numPr>
+          <w:ilvl w:val="0"/>
+          <w:numId w:val="19"/>
+        </w:numPr>
+      </w:pPr>
+      <w:r>
+        <w:t xml:space="preserve">Hub Reset </w:t>
+      </w:r>
+    </w:p>
+    <w:p>
+      <w:pPr>
+        <w:pStyle w:val="ListParagraph"/>
+        <w:numPr>
+          <w:ilvl w:val="0"/>
+          <w:numId w:val="19"/>
+        </w:numPr>
+      </w:pPr>
+      <w:r>
+        <w:t xml:space="preserve">SWD </w:t>
+      </w:r>
+    </w:p>
+    <w:p>
+      <w:pPr>
+        <w:pStyle w:val="ListParagraph"/>
+        <w:numPr>
+          <w:ilvl w:val="0"/>
+          <w:numId w:val="19"/>
+        </w:numPr>
+      </w:pPr>
+      <w:r>
+        <w:t xml:space="preserve">UART </w:t>
+      </w:r>
+    </w:p>
+    <w:p>
+      <w:pPr>
+        <w:pStyle w:val="ListParagraph"/>
+        <w:numPr>
+          <w:ilvl w:val="0"/>
+          <w:numId w:val="19"/>
+        </w:numPr>
+      </w:pPr>
+      <w:r>
+        <w:t xml:space="preserve">Test points </w:t>
+      </w:r>
+    </w:p>
+    <w:p>
+      <w:r>
+        <w:t>Test Points</w:t>
+      </w:r>
+    </w:p>
+    <w:p>
+      <w:pPr>
+        <w:pStyle w:val="ListParagraph"/>
+        <w:numPr>
+          <w:ilvl w:val="0"/>
+          <w:numId w:val="20"/>
+        </w:numPr>
+      </w:pPr>
+      <w:r>
+        <w:t xml:space="preserve">VIN </w:t>
+      </w:r>
+    </w:p>
+    <w:p>
+      <w:pPr>
+        <w:pStyle w:val="ListParagraph"/>
+        <w:numPr>
+          <w:ilvl w:val="0"/>
+          <w:numId w:val="20"/>
+        </w:numPr>
+      </w:pPr>
+      <w:r>
+        <w:t xml:space="preserve">12 V </w:t>
+      </w:r>
+    </w:p>
+    <w:p>
+      <w:pPr>
+        <w:pStyle w:val="ListParagraph"/>
+        <w:numPr>
+          <w:ilvl w:val="0"/>
+          <w:numId w:val="20"/>
+        </w:numPr>
+      </w:pPr>
+      <w:r>
+        <w:t xml:space="preserve">5 V </w:t>
+      </w:r>
+    </w:p>
+    <w:p>
+      <w:pPr>
+        <w:pStyle w:val="ListParagraph"/>
+        <w:numPr>
+          <w:ilvl w:val="0"/>
+          <w:numId w:val="20"/>
+        </w:numPr>
+      </w:pPr>
+      <w:r>
+        <w:t xml:space="preserve">Hub Reset </w:t>
+      </w:r>
+    </w:p>
+    <w:p>
+      <w:pPr>
+        <w:pStyle w:val="ListParagraph"/>
+        <w:numPr>
+          <w:ilvl w:val="0"/>
+          <w:numId w:val="20"/>
+        </w:numPr>
+      </w:pPr>
+      <w:r>
+        <w:t xml:space="preserve">Fan PWM </w:t>
+      </w:r>
+    </w:p>
+    <w:p>
+      <w:pPr>
+        <w:pStyle w:val="ListParagraph"/>
+        <w:numPr>
+          <w:ilvl w:val="0"/>
+          <w:numId w:val="20"/>
+        </w:numPr>
+      </w:pPr>
+      <w:r>
+        <w:t xml:space="preserve">Fan Tach </w:t>
+      </w:r>
+    </w:p>
+    <w:p>
+      <w:pPr>
+        <w:pStyle w:val="ListParagraph"/>
+        <w:numPr>
+          <w:ilvl w:val="0"/>
+          <w:numId w:val="20"/>
+        </w:numPr>
+      </w:pPr>
+      <w:r>
+        <w:t xml:space="preserve">CC pins (at least one port) </w:t>
+      </w:r>
+    </w:p>
+    <w:p>
+      <w:pPr>
+        <w:pStyle w:val="ListParagraph"/>
+        <w:numPr>
+          <w:ilvl w:val="0"/>
+          <w:numId w:val="20"/>
+        </w:numPr>
+      </w:pPr>
+      <w:r>
+        <w:lastRenderedPageBreak/>
+        <w:t xml:space="preserve">USB enable lines </w:t>
+      </w:r>
+    </w:p>
+    <w:p>
+      <w:pPr>
+        <w:pStyle w:val="ListParagraph"/>
+        <w:numPr>
+          <w:ilvl w:val="0"/>
+          <w:numId w:val="20"/>
+        </w:numPr>
+      </w:pPr>
+      <w:r>
+        <w:t xml:space="preserve">Current monitor outputs </w:t>
+      </w:r>
+    </w:p>
+    <w:p>
+      <w:r>
+        <w:pict w14:anchorId="37FE2811">
+          <v:rect id="_x0000_i1034" style="width:0;height:1.5pt" o:hralign="center" o:hrstd="t" o:hr="t" fillcolor="#a0a0a0" stroked="f"/>
+        </w:pict>
+      </w:r>
+    </w:p>
+    <w:p>
+      <w:r>
+        <w:t>14. PCB</w:t>
+      </w:r>
+    </w:p>
+    <w:p>
+      <w:r>
+        <w:t>6 Layer</w:t>
+      </w:r>
+    </w:p>
+    <w:p>
+      <w:r>
+        <w:t>Recommended stack</w:t>
+      </w:r>
+    </w:p>
+    <w:p>
+      <w:r>
+        <w:t>Top</w:t>
+      </w:r>
+    </w:p>
+    <w:p>
+      <w:r>
+        <w:t>Ground</w:t>
       </w:r>
     </w:p>
     <w:p>
@@ -2585,835 +3217,89 @@
       </w:r>
     </w:p>
     <w:p>
-      <w:pPr>
-        <w:pStyle w:val="ListParagraph"/>
-        <w:numPr>
-          <w:ilvl w:val="0"/>
-          <w:numId w:val="11"/>
-        </w:numPr>
-      </w:pPr>
-      <w:r>
-        <w:t xml:space="preserve">PWM </w:t>
-      </w:r>
-    </w:p>
-    <w:p>
-      <w:pPr>
-        <w:pStyle w:val="ListParagraph"/>
-        <w:numPr>
-          <w:ilvl w:val="0"/>
-          <w:numId w:val="11"/>
-        </w:numPr>
-      </w:pPr>
-      <w:r>
-        <w:t xml:space="preserve">Tachometer </w:t>
-      </w:r>
-    </w:p>
-    <w:p>
-      <w:r>
-        <w:t>Future MCU controls speed.</w:t>
-      </w:r>
-    </w:p>
-    <w:p>
-      <w:r>
-        <w:pict w14:anchorId="1BA0E9DC">
-          <v:rect id="_x0000_i1288" style="width:0;height:1.5pt" o:hralign="center" o:hrstd="t" o:hr="t" fillcolor="#a0a0a0" stroked="f"/>
+      <w:r>
+        <w:t>Power</w:t>
+      </w:r>
+    </w:p>
+    <w:p>
+      <w:r>
+        <w:t>Ground</w:t>
+      </w:r>
+    </w:p>
+    <w:p>
+      <w:r>
+        <w:t>Bottom</w:t>
+      </w:r>
+    </w:p>
+    <w:p>
+      <w:r>
+        <w:t>Requirements</w:t>
+      </w:r>
+    </w:p>
+    <w:p>
+      <w:pPr>
+        <w:pStyle w:val="ListParagraph"/>
+        <w:numPr>
+          <w:ilvl w:val="0"/>
+          <w:numId w:val="21"/>
+        </w:numPr>
+      </w:pPr>
+      <w:r>
+        <w:t xml:space="preserve">Controlled impedance </w:t>
+      </w:r>
+    </w:p>
+    <w:p>
+      <w:pPr>
+        <w:pStyle w:val="ListParagraph"/>
+        <w:numPr>
+          <w:ilvl w:val="0"/>
+          <w:numId w:val="21"/>
+        </w:numPr>
+      </w:pPr>
+      <w:r>
+        <w:t xml:space="preserve">Ground stitching </w:t>
+      </w:r>
+    </w:p>
+    <w:p>
+      <w:pPr>
+        <w:pStyle w:val="ListParagraph"/>
+        <w:numPr>
+          <w:ilvl w:val="0"/>
+          <w:numId w:val="21"/>
+        </w:numPr>
+      </w:pPr>
+      <w:r>
+        <w:t xml:space="preserve">Continuous reference planes </w:t>
+      </w:r>
+    </w:p>
+    <w:p>
+      <w:pPr>
+        <w:pStyle w:val="ListParagraph"/>
+        <w:numPr>
+          <w:ilvl w:val="0"/>
+          <w:numId w:val="21"/>
+        </w:numPr>
+      </w:pPr>
+      <w:r>
+        <w:t xml:space="preserve">Decoupling adjacent to every IC </w:t>
+      </w:r>
+    </w:p>
+    <w:p>
+      <w:r>
+        <w:pict w14:anchorId="2C53E3AD">
+          <v:rect id="_x0000_i1035" style="width:0;height:1.5pt" o:hralign="center" o:hrstd="t" o:hr="t" fillcolor="#a0a0a0" stroked="f"/>
         </w:pict>
       </w:r>
     </w:p>
     <w:p>
       <w:r>
-        <w:t>8. Future MCU</w:t>
-      </w:r>
-    </w:p>
-    <w:p>
-      <w:r>
-        <w:t>No MCU selected.</w:t>
-      </w:r>
-    </w:p>
-    <w:p>
-      <w:r>
-        <w:t>Provide:</w:t>
-      </w:r>
-    </w:p>
-    <w:p>
-      <w:pPr>
-        <w:pStyle w:val="ListParagraph"/>
-        <w:numPr>
-          <w:ilvl w:val="0"/>
-          <w:numId w:val="12"/>
-        </w:numPr>
-      </w:pPr>
-      <w:r>
-        <w:t xml:space="preserve">Footprint area </w:t>
-      </w:r>
-    </w:p>
-    <w:p>
-      <w:pPr>
-        <w:pStyle w:val="ListParagraph"/>
-        <w:numPr>
-          <w:ilvl w:val="0"/>
-          <w:numId w:val="12"/>
-        </w:numPr>
-      </w:pPr>
-      <w:r>
-        <w:t xml:space="preserve">SWD </w:t>
-      </w:r>
-    </w:p>
-    <w:p>
-      <w:pPr>
-        <w:pStyle w:val="ListParagraph"/>
-        <w:numPr>
-          <w:ilvl w:val="0"/>
-          <w:numId w:val="12"/>
-        </w:numPr>
-      </w:pPr>
-      <w:r>
-        <w:t xml:space="preserve">UART </w:t>
-      </w:r>
-    </w:p>
-    <w:p>
-      <w:pPr>
-        <w:pStyle w:val="ListParagraph"/>
-        <w:numPr>
-          <w:ilvl w:val="0"/>
-          <w:numId w:val="12"/>
-        </w:numPr>
-      </w:pPr>
-      <w:r>
-        <w:t xml:space="preserve">GPIO </w:t>
-      </w:r>
-    </w:p>
-    <w:p>
-      <w:pPr>
-        <w:pStyle w:val="ListParagraph"/>
-        <w:numPr>
-          <w:ilvl w:val="0"/>
-          <w:numId w:val="12"/>
-        </w:numPr>
-      </w:pPr>
-      <w:r>
-        <w:t xml:space="preserve">I²C </w:t>
-      </w:r>
-    </w:p>
-    <w:p>
-      <w:pPr>
-        <w:pStyle w:val="ListParagraph"/>
-        <w:numPr>
-          <w:ilvl w:val="0"/>
-          <w:numId w:val="12"/>
-        </w:numPr>
-      </w:pPr>
-      <w:r>
-        <w:t xml:space="preserve">ADC inputs </w:t>
-      </w:r>
-    </w:p>
-    <w:p>
-      <w:r>
-        <w:t>Connections</w:t>
-      </w:r>
-    </w:p>
-    <w:p>
-      <w:pPr>
-        <w:pStyle w:val="ListParagraph"/>
-        <w:numPr>
-          <w:ilvl w:val="0"/>
-          <w:numId w:val="13"/>
-        </w:numPr>
-      </w:pPr>
-      <w:r>
-        <w:t xml:space="preserve">Fan PWM </w:t>
-      </w:r>
-    </w:p>
-    <w:p>
-      <w:pPr>
-        <w:pStyle w:val="ListParagraph"/>
-        <w:numPr>
-          <w:ilvl w:val="0"/>
-          <w:numId w:val="13"/>
-        </w:numPr>
-      </w:pPr>
-      <w:r>
-        <w:t xml:space="preserve">Fan Tach </w:t>
-      </w:r>
-    </w:p>
-    <w:p>
-      <w:pPr>
-        <w:pStyle w:val="ListParagraph"/>
-        <w:numPr>
-          <w:ilvl w:val="0"/>
-          <w:numId w:val="13"/>
-        </w:numPr>
-      </w:pPr>
-      <w:r>
-        <w:t xml:space="preserve">Temperature </w:t>
-      </w:r>
-    </w:p>
-    <w:p>
-      <w:pPr>
-        <w:pStyle w:val="ListParagraph"/>
-        <w:numPr>
-          <w:ilvl w:val="0"/>
-          <w:numId w:val="13"/>
-        </w:numPr>
-      </w:pPr>
-      <w:r>
-        <w:t xml:space="preserve">Current sensors </w:t>
-      </w:r>
-    </w:p>
-    <w:p>
-      <w:pPr>
-        <w:pStyle w:val="ListParagraph"/>
-        <w:numPr>
-          <w:ilvl w:val="0"/>
-          <w:numId w:val="13"/>
-        </w:numPr>
-      </w:pPr>
-      <w:r>
-        <w:t xml:space="preserve">LEDs </w:t>
-      </w:r>
-    </w:p>
-    <w:p>
-      <w:pPr>
-        <w:pStyle w:val="ListParagraph"/>
-        <w:numPr>
-          <w:ilvl w:val="0"/>
-          <w:numId w:val="13"/>
-        </w:numPr>
-      </w:pPr>
-      <w:r>
-        <w:t xml:space="preserve">Hub reset </w:t>
-      </w:r>
-    </w:p>
-    <w:p>
-      <w:r>
-        <w:pict w14:anchorId="07385BDE">
-          <v:rect id="_x0000_i1289" style="width:0;height:1.5pt" o:hralign="center" o:hrstd="t" o:hr="t" fillcolor="#a0a0a0" stroked="f"/>
-        </w:pict>
-      </w:r>
-    </w:p>
-    <w:p>
-      <w:r>
-        <w:t>9. LEDs</w:t>
-      </w:r>
-    </w:p>
-    <w:p>
-      <w:r>
-        <w:t>Populate footprints for</w:t>
-      </w:r>
-    </w:p>
-    <w:p>
-      <w:r>
-        <w:t>Mandatory</w:t>
-      </w:r>
-    </w:p>
-    <w:p>
-      <w:pPr>
-        <w:pStyle w:val="ListParagraph"/>
-        <w:numPr>
-          <w:ilvl w:val="0"/>
-          <w:numId w:val="14"/>
-        </w:numPr>
-      </w:pPr>
-      <w:r>
-        <w:t xml:space="preserve">Power </w:t>
-      </w:r>
-    </w:p>
-    <w:p>
-      <w:pPr>
-        <w:pStyle w:val="ListParagraph"/>
-        <w:numPr>
-          <w:ilvl w:val="0"/>
-          <w:numId w:val="14"/>
-        </w:numPr>
-      </w:pPr>
-      <w:r>
-        <w:t xml:space="preserve">Hub Active </w:t>
-      </w:r>
-    </w:p>
-    <w:p>
-      <w:r>
-        <w:t>Optional</w:t>
-      </w:r>
-    </w:p>
-    <w:p>
-      <w:pPr>
-        <w:pStyle w:val="ListParagraph"/>
-        <w:numPr>
-          <w:ilvl w:val="0"/>
-          <w:numId w:val="15"/>
-        </w:numPr>
-      </w:pPr>
-      <w:r>
-        <w:t xml:space="preserve">Front Port Activity ×2 </w:t>
-      </w:r>
-    </w:p>
-    <w:p>
-      <w:pPr>
-        <w:pStyle w:val="ListParagraph"/>
-        <w:numPr>
-          <w:ilvl w:val="0"/>
-          <w:numId w:val="15"/>
-        </w:numPr>
-      </w:pPr>
-      <w:r>
-        <w:t xml:space="preserve">Rear Port Activity </w:t>
-      </w:r>
-    </w:p>
-    <w:p>
-      <w:pPr>
-        <w:pStyle w:val="ListParagraph"/>
-        <w:numPr>
-          <w:ilvl w:val="0"/>
-          <w:numId w:val="15"/>
-        </w:numPr>
-      </w:pPr>
-      <w:r>
-        <w:t xml:space="preserve">SD Activity </w:t>
-      </w:r>
-    </w:p>
-    <w:p>
-      <w:pPr>
-        <w:pStyle w:val="ListParagraph"/>
-        <w:numPr>
-          <w:ilvl w:val="0"/>
-          <w:numId w:val="15"/>
-        </w:numPr>
-      </w:pPr>
-      <w:r>
-        <w:t xml:space="preserve">Overcurrent indicators </w:t>
-      </w:r>
-    </w:p>
-    <w:p>
-      <w:pPr>
-        <w:pStyle w:val="ListParagraph"/>
-        <w:numPr>
-          <w:ilvl w:val="0"/>
-          <w:numId w:val="15"/>
-        </w:numPr>
-      </w:pPr>
-      <w:r>
-        <w:t xml:space="preserve">MCU status </w:t>
-      </w:r>
-    </w:p>
-    <w:p>
-      <w:r>
-        <w:lastRenderedPageBreak/>
-        <w:pict w14:anchorId="1828F6F1">
-          <v:rect id="_x0000_i1290" style="width:0;height:1.5pt" o:hralign="center" o:hrstd="t" o:hr="t" fillcolor="#a0a0a0" stroked="f"/>
-        </w:pict>
-      </w:r>
-    </w:p>
-    <w:p>
-      <w:r>
-        <w:t>10. Temperature Monitoring</w:t>
-      </w:r>
-    </w:p>
-    <w:p>
-      <w:r>
-        <w:t>Provide footprint for</w:t>
-      </w:r>
-    </w:p>
-    <w:p>
-      <w:r>
-        <w:t>Digital temperature sensor</w:t>
-      </w:r>
-    </w:p>
-    <w:p>
-      <w:r>
-        <w:t>or</w:t>
-      </w:r>
-    </w:p>
-    <w:p>
-      <w:r>
-        <w:t>NTC thermistor</w:t>
-      </w:r>
-    </w:p>
-    <w:p>
-      <w:r>
-        <w:t>Located near</w:t>
-      </w:r>
-    </w:p>
-    <w:p>
-      <w:pPr>
-        <w:pStyle w:val="ListParagraph"/>
-        <w:numPr>
-          <w:ilvl w:val="0"/>
-          <w:numId w:val="16"/>
-        </w:numPr>
-      </w:pPr>
-      <w:r>
-        <w:t xml:space="preserve">Buck regulator </w:t>
-      </w:r>
-    </w:p>
-    <w:p>
-      <w:pPr>
-        <w:pStyle w:val="ListParagraph"/>
-        <w:numPr>
-          <w:ilvl w:val="0"/>
-          <w:numId w:val="16"/>
-        </w:numPr>
-      </w:pPr>
-      <w:r>
-        <w:t xml:space="preserve">Hub controller </w:t>
-      </w:r>
-    </w:p>
-    <w:p>
-      <w:r>
-        <w:pict w14:anchorId="7696443A">
-          <v:rect id="_x0000_i1291" style="width:0;height:1.5pt" o:hralign="center" o:hrstd="t" o:hr="t" fillcolor="#a0a0a0" stroked="f"/>
-        </w:pict>
-      </w:r>
-    </w:p>
-    <w:p>
-      <w:r>
-        <w:t>11. Protection</w:t>
-      </w:r>
-    </w:p>
-    <w:p>
-      <w:r>
-        <w:t>Every external connector receives ESD protection.</w:t>
-      </w:r>
-    </w:p>
-    <w:p>
-      <w:r>
-        <w:t>Protected interfaces</w:t>
-      </w:r>
-    </w:p>
-    <w:p>
-      <w:pPr>
-        <w:pStyle w:val="ListParagraph"/>
-        <w:numPr>
-          <w:ilvl w:val="0"/>
-          <w:numId w:val="17"/>
-        </w:numPr>
-      </w:pPr>
-      <w:r>
-        <w:t xml:space="preserve">USB-C ×4 </w:t>
-      </w:r>
-    </w:p>
-    <w:p>
-      <w:pPr>
-        <w:pStyle w:val="ListParagraph"/>
-        <w:numPr>
-          <w:ilvl w:val="0"/>
-          <w:numId w:val="17"/>
-        </w:numPr>
-      </w:pPr>
-      <w:r>
-        <w:t xml:space="preserve">SD </w:t>
-      </w:r>
-    </w:p>
-    <w:p>
-      <w:pPr>
-        <w:pStyle w:val="ListParagraph"/>
-        <w:numPr>
-          <w:ilvl w:val="0"/>
-          <w:numId w:val="17"/>
-        </w:numPr>
-      </w:pPr>
-      <w:r>
-        <w:t xml:space="preserve">microSD </w:t>
-      </w:r>
-    </w:p>
-    <w:p>
-      <w:pPr>
-        <w:pStyle w:val="ListParagraph"/>
-        <w:numPr>
-          <w:ilvl w:val="0"/>
-          <w:numId w:val="17"/>
-        </w:numPr>
-      </w:pPr>
-      <w:r>
-        <w:t xml:space="preserve">Barrel Jack </w:t>
-      </w:r>
-    </w:p>
-    <w:p>
-      <w:r>
-        <w:pict w14:anchorId="7DC46C9D">
-          <v:rect id="_x0000_i1292" style="width:0;height:1.5pt" o:hralign="center" o:hrstd="t" o:hr="t" fillcolor="#a0a0a0" stroked="f"/>
-        </w:pict>
-      </w:r>
-    </w:p>
-    <w:p>
-      <w:r>
-        <w:t>12. Internal Expansion</w:t>
-      </w:r>
-    </w:p>
-    <w:p>
-      <w:r>
-        <w:t>Provide</w:t>
-      </w:r>
-    </w:p>
-    <w:p>
-      <w:pPr>
-        <w:pStyle w:val="ListParagraph"/>
-        <w:numPr>
-          <w:ilvl w:val="0"/>
-          <w:numId w:val="18"/>
-        </w:numPr>
-      </w:pPr>
-      <w:r>
-        <w:t xml:space="preserve">Internal USB Header </w:t>
-      </w:r>
-    </w:p>
-    <w:p>
-      <w:pPr>
-        <w:pStyle w:val="ListParagraph"/>
-        <w:numPr>
-          <w:ilvl w:val="0"/>
-          <w:numId w:val="18"/>
-        </w:numPr>
-      </w:pPr>
-      <w:r>
-        <w:t xml:space="preserve">12 V Header </w:t>
-      </w:r>
-    </w:p>
-    <w:p>
-      <w:pPr>
-        <w:pStyle w:val="ListParagraph"/>
-        <w:numPr>
-          <w:ilvl w:val="0"/>
-          <w:numId w:val="18"/>
-        </w:numPr>
-      </w:pPr>
-      <w:r>
-        <w:t xml:space="preserve">I²C Header </w:t>
-      </w:r>
-    </w:p>
-    <w:p>
-      <w:pPr>
-        <w:pStyle w:val="ListParagraph"/>
-        <w:numPr>
-          <w:ilvl w:val="0"/>
-          <w:numId w:val="18"/>
-        </w:numPr>
-      </w:pPr>
-      <w:r>
-        <w:t xml:space="preserve">UART Header </w:t>
-      </w:r>
-    </w:p>
-    <w:p>
-      <w:pPr>
-        <w:pStyle w:val="ListParagraph"/>
-        <w:numPr>
-          <w:ilvl w:val="0"/>
-          <w:numId w:val="18"/>
-        </w:numPr>
-      </w:pPr>
-      <w:r>
-        <w:t xml:space="preserve">GPIO Header </w:t>
-      </w:r>
-    </w:p>
-    <w:p>
-      <w:r>
-        <w:pict w14:anchorId="7387B380">
-          <v:rect id="_x0000_i1293" style="width:0;height:1.5pt" o:hralign="center" o:hrstd="t" o:hr="t" fillcolor="#a0a0a0" stroked="f"/>
-        </w:pict>
-      </w:r>
-    </w:p>
-    <w:p>
-      <w:r>
-        <w:t>13. Debug</w:t>
-      </w:r>
-    </w:p>
-    <w:p>
-      <w:r>
-        <w:t>Provide</w:t>
-      </w:r>
-    </w:p>
-    <w:p>
-      <w:pPr>
-        <w:pStyle w:val="ListParagraph"/>
-        <w:numPr>
-          <w:ilvl w:val="0"/>
-          <w:numId w:val="19"/>
-        </w:numPr>
-      </w:pPr>
-      <w:r>
-        <w:t xml:space="preserve">Hub Reset </w:t>
-      </w:r>
-    </w:p>
-    <w:p>
-      <w:pPr>
-        <w:pStyle w:val="ListParagraph"/>
-        <w:numPr>
-          <w:ilvl w:val="0"/>
-          <w:numId w:val="19"/>
-        </w:numPr>
-      </w:pPr>
-      <w:r>
-        <w:t xml:space="preserve">SWD </w:t>
-      </w:r>
-    </w:p>
-    <w:p>
-      <w:pPr>
-        <w:pStyle w:val="ListParagraph"/>
-        <w:numPr>
-          <w:ilvl w:val="0"/>
-          <w:numId w:val="19"/>
-        </w:numPr>
-      </w:pPr>
-      <w:r>
-        <w:t xml:space="preserve">UART </w:t>
-      </w:r>
-    </w:p>
-    <w:p>
-      <w:pPr>
-        <w:pStyle w:val="ListParagraph"/>
-        <w:numPr>
-          <w:ilvl w:val="0"/>
-          <w:numId w:val="19"/>
-        </w:numPr>
-      </w:pPr>
-      <w:r>
-        <w:t xml:space="preserve">Test points </w:t>
-      </w:r>
-    </w:p>
-    <w:p>
-      <w:r>
-        <w:t>Test Points</w:t>
-      </w:r>
-    </w:p>
-    <w:p>
-      <w:pPr>
-        <w:pStyle w:val="ListParagraph"/>
-        <w:numPr>
-          <w:ilvl w:val="0"/>
-          <w:numId w:val="20"/>
-        </w:numPr>
-      </w:pPr>
-      <w:r>
-        <w:lastRenderedPageBreak/>
-        <w:t xml:space="preserve">VIN </w:t>
-      </w:r>
-    </w:p>
-    <w:p>
-      <w:pPr>
-        <w:pStyle w:val="ListParagraph"/>
-        <w:numPr>
-          <w:ilvl w:val="0"/>
-          <w:numId w:val="20"/>
-        </w:numPr>
-      </w:pPr>
-      <w:r>
-        <w:t xml:space="preserve">12 V </w:t>
-      </w:r>
-    </w:p>
-    <w:p>
-      <w:pPr>
-        <w:pStyle w:val="ListParagraph"/>
-        <w:numPr>
-          <w:ilvl w:val="0"/>
-          <w:numId w:val="20"/>
-        </w:numPr>
-      </w:pPr>
-      <w:r>
-        <w:t xml:space="preserve">5 V </w:t>
-      </w:r>
-    </w:p>
-    <w:p>
-      <w:pPr>
-        <w:pStyle w:val="ListParagraph"/>
-        <w:numPr>
-          <w:ilvl w:val="0"/>
-          <w:numId w:val="20"/>
-        </w:numPr>
-      </w:pPr>
-      <w:r>
-        <w:t xml:space="preserve">Hub Reset </w:t>
-      </w:r>
-    </w:p>
-    <w:p>
-      <w:pPr>
-        <w:pStyle w:val="ListParagraph"/>
-        <w:numPr>
-          <w:ilvl w:val="0"/>
-          <w:numId w:val="20"/>
-        </w:numPr>
-      </w:pPr>
-      <w:r>
-        <w:t xml:space="preserve">Fan PWM </w:t>
-      </w:r>
-    </w:p>
-    <w:p>
-      <w:pPr>
-        <w:pStyle w:val="ListParagraph"/>
-        <w:numPr>
-          <w:ilvl w:val="0"/>
-          <w:numId w:val="20"/>
-        </w:numPr>
-      </w:pPr>
-      <w:r>
-        <w:t xml:space="preserve">Fan Tach </w:t>
-      </w:r>
-    </w:p>
-    <w:p>
-      <w:pPr>
-        <w:pStyle w:val="ListParagraph"/>
-        <w:numPr>
-          <w:ilvl w:val="0"/>
-          <w:numId w:val="20"/>
-        </w:numPr>
-      </w:pPr>
-      <w:r>
-        <w:t xml:space="preserve">CC pins (at least one port) </w:t>
-      </w:r>
-    </w:p>
-    <w:p>
-      <w:pPr>
-        <w:pStyle w:val="ListParagraph"/>
-        <w:numPr>
-          <w:ilvl w:val="0"/>
-          <w:numId w:val="20"/>
-        </w:numPr>
-      </w:pPr>
-      <w:r>
-        <w:t xml:space="preserve">USB enable lines </w:t>
-      </w:r>
-    </w:p>
-    <w:p>
-      <w:pPr>
-        <w:pStyle w:val="ListParagraph"/>
-        <w:numPr>
-          <w:ilvl w:val="0"/>
-          <w:numId w:val="20"/>
-        </w:numPr>
-      </w:pPr>
-      <w:r>
-        <w:t xml:space="preserve">Current monitor outputs </w:t>
-      </w:r>
-    </w:p>
-    <w:p>
-      <w:r>
-        <w:pict w14:anchorId="37FE2811">
-          <v:rect id="_x0000_i1294" style="width:0;height:1.5pt" o:hralign="center" o:hrstd="t" o:hr="t" fillcolor="#a0a0a0" stroked="f"/>
-        </w:pict>
-      </w:r>
-    </w:p>
-    <w:p>
-      <w:r>
-        <w:t>14. PCB</w:t>
-      </w:r>
-    </w:p>
-    <w:p>
-      <w:r>
-        <w:t>6 Layer</w:t>
-      </w:r>
-    </w:p>
-    <w:p>
-      <w:r>
-        <w:t>Recommended stack</w:t>
-      </w:r>
-    </w:p>
-    <w:p>
-      <w:r>
-        <w:t>Top</w:t>
-      </w:r>
-    </w:p>
-    <w:p>
-      <w:r>
-        <w:t>Ground</w:t>
-      </w:r>
-    </w:p>
-    <w:p>
-      <w:r>
-        <w:t>Signals</w:t>
-      </w:r>
-    </w:p>
-    <w:p>
-      <w:r>
-        <w:t>Power</w:t>
-      </w:r>
-    </w:p>
-    <w:p>
-      <w:r>
-        <w:t>Ground</w:t>
-      </w:r>
-    </w:p>
-    <w:p>
-      <w:r>
-        <w:t>Bottom</w:t>
-      </w:r>
-    </w:p>
-    <w:p>
-      <w:r>
-        <w:t>Requirements</w:t>
-      </w:r>
-    </w:p>
-    <w:p>
-      <w:pPr>
-        <w:pStyle w:val="ListParagraph"/>
-        <w:numPr>
-          <w:ilvl w:val="0"/>
-          <w:numId w:val="21"/>
-        </w:numPr>
-      </w:pPr>
-      <w:r>
-        <w:t xml:space="preserve">Controlled impedance </w:t>
-      </w:r>
-    </w:p>
-    <w:p>
-      <w:pPr>
-        <w:pStyle w:val="ListParagraph"/>
-        <w:numPr>
-          <w:ilvl w:val="0"/>
-          <w:numId w:val="21"/>
-        </w:numPr>
-      </w:pPr>
-      <w:r>
-        <w:t xml:space="preserve">Ground stitching </w:t>
-      </w:r>
-    </w:p>
-    <w:p>
-      <w:pPr>
-        <w:pStyle w:val="ListParagraph"/>
-        <w:numPr>
-          <w:ilvl w:val="0"/>
-          <w:numId w:val="21"/>
-        </w:numPr>
-      </w:pPr>
-      <w:r>
-        <w:t xml:space="preserve">Continuous reference planes </w:t>
-      </w:r>
-    </w:p>
-    <w:p>
-      <w:pPr>
-        <w:pStyle w:val="ListParagraph"/>
-        <w:numPr>
-          <w:ilvl w:val="0"/>
-          <w:numId w:val="21"/>
-        </w:numPr>
-      </w:pPr>
-      <w:r>
-        <w:t xml:space="preserve">Decoupling adjacent to every IC </w:t>
-      </w:r>
-    </w:p>
-    <w:p>
-      <w:r>
-        <w:pict w14:anchorId="2C53E3AD">
-          <v:rect id="_x0000_i1295" style="width:0;height:1.5pt" o:hralign="center" o:hrstd="t" o:hr="t" fillcolor="#a0a0a0" stroked="f"/>
-        </w:pict>
-      </w:r>
-    </w:p>
-    <w:p>
-      <w:r>
-        <w:t xml:space="preserve">15. Hierarchical </w:t>
-      </w:r>
-      <w:proofErr w:type="spellStart"/>
-      <w:r>
-        <w:t>KiCad</w:t>
-      </w:r>
-      <w:proofErr w:type="spellEnd"/>
-      <w:r>
-        <w:t xml:space="preserve"> Structure</w:t>
-      </w:r>
-    </w:p>
-    <w:p>
-      <w:proofErr w:type="spellStart"/>
+        <w:t>15. Hierarchical KiCad Structure</w:t>
+      </w:r>
+    </w:p>
+    <w:p>
       <w:r>
         <w:t>USB_Fan_Hub.kicad_sch</w:t>
       </w:r>
-      <w:proofErr w:type="spellEnd"/>
     </w:p>
     <w:p/>
     <w:p>
@@ -3430,13 +3316,8 @@
         <w:t>──</w:t>
       </w:r>
       <w:r>
-        <w:t xml:space="preserve"> </w:t>
-      </w:r>
-      <w:proofErr w:type="spellStart"/>
-      <w:r>
-        <w:t>Power_Input</w:t>
-      </w:r>
-      <w:proofErr w:type="spellEnd"/>
+        <w:t xml:space="preserve"> Power_Input</w:t>
+      </w:r>
     </w:p>
     <w:p>
       <w:r>
@@ -3452,13 +3333,8 @@
         <w:t>──</w:t>
       </w:r>
       <w:r>
-        <w:t xml:space="preserve"> </w:t>
-      </w:r>
-      <w:proofErr w:type="spellStart"/>
-      <w:r>
-        <w:t>CoreRegs</w:t>
-      </w:r>
-      <w:proofErr w:type="spellEnd"/>
+        <w:t xml:space="preserve"> CoreRegs</w:t>
+      </w:r>
     </w:p>
     <w:p>
       <w:r>
@@ -3474,13 +3350,8 @@
         <w:t>──</w:t>
       </w:r>
       <w:r>
-        <w:t xml:space="preserve"> </w:t>
-      </w:r>
-      <w:proofErr w:type="spellStart"/>
-      <w:r>
-        <w:t>USB_Hub_Core</w:t>
-      </w:r>
-      <w:proofErr w:type="spellEnd"/>
+        <w:t xml:space="preserve"> USB_Hub_Core</w:t>
+      </w:r>
     </w:p>
     <w:p>
       <w:r>
@@ -3496,13 +3367,8 @@
         <w:t>──</w:t>
       </w:r>
       <w:r>
-        <w:t xml:space="preserve"> </w:t>
-      </w:r>
-      <w:proofErr w:type="spellStart"/>
-      <w:r>
-        <w:t>USB_Upstream</w:t>
-      </w:r>
-      <w:proofErr w:type="spellEnd"/>
+        <w:t xml:space="preserve"> USB_Upstream</w:t>
+      </w:r>
     </w:p>
     <w:p>
       <w:r>
@@ -3518,15 +3384,75 @@
         <w:t>──</w:t>
       </w:r>
       <w:r>
-        <w:t xml:space="preserve"> </w:t>
-      </w:r>
-      <w:proofErr w:type="spellStart"/>
-      <w:r>
-        <w:t>USB_Downstream</w:t>
-      </w:r>
-      <w:proofErr w:type="spellEnd"/>
-      <w:r>
-        <w:t xml:space="preserve"> (Front Left)</w:t>
+        <w:t xml:space="preserve"> USB_Downstream (Front Left)</w:t>
+      </w:r>
+    </w:p>
+    <w:p>
+      <w:r>
+        <w:rPr>
+          <w:rFonts w:eastAsia="MS Gothic" w:cs="MS Gothic"/>
+        </w:rPr>
+        <w:t>├</w:t>
+      </w:r>
+      <w:r>
+        <w:rPr>
+          <w:rFonts w:cs="Aptos"/>
+        </w:rPr>
+        <w:t>──</w:t>
+      </w:r>
+      <w:r>
+        <w:t xml:space="preserve"> USB_Downstream (Front Right)</w:t>
+      </w:r>
+    </w:p>
+    <w:p>
+      <w:r>
+        <w:rPr>
+          <w:rFonts w:eastAsia="MS Gothic" w:cs="MS Gothic"/>
+        </w:rPr>
+        <w:t>├</w:t>
+      </w:r>
+      <w:r>
+        <w:rPr>
+          <w:rFonts w:cs="Aptos"/>
+        </w:rPr>
+        <w:t>──</w:t>
+      </w:r>
+      <w:r>
+        <w:t xml:space="preserve"> USB_Downstream (Rear)</w:t>
+      </w:r>
+    </w:p>
+    <w:p>
+      <w:r>
+        <w:rPr>
+          <w:rFonts w:eastAsia="MS Gothic" w:cs="MS Gothic"/>
+        </w:rPr>
+        <w:t>├</w:t>
+      </w:r>
+      <w:r>
+        <w:rPr>
+          <w:rFonts w:cs="Aptos"/>
+        </w:rPr>
+        <w:t>──</w:t>
+      </w:r>
+      <w:r>
+        <w:t xml:space="preserve"> SD_Reader</w:t>
+      </w:r>
+    </w:p>
+    <w:p>
+      <w:r>
+        <w:rPr>
+          <w:rFonts w:eastAsia="MS Gothic" w:cs="MS Gothic"/>
+        </w:rPr>
+        <w:t>├</w:t>
+      </w:r>
+      <w:r>
+        <w:rPr>
+          <w:rFonts w:cs="Aptos"/>
+        </w:rPr>
+        <w:t>──</w:t>
+      </w:r>
+      <w:r>
+        <w:t xml:space="preserve"> Fan</w:t>
       </w:r>
     </w:p>
     <w:p>
@@ -3544,95 +3470,6 @@
         <w:t>──</w:t>
       </w:r>
       <w:r>
-        <w:t xml:space="preserve"> </w:t>
-      </w:r>
-      <w:proofErr w:type="spellStart"/>
-      <w:r>
-        <w:t>USB_Downstream</w:t>
-      </w:r>
-      <w:proofErr w:type="spellEnd"/>
-      <w:r>
-        <w:t xml:space="preserve"> (Front Right)</w:t>
-      </w:r>
-    </w:p>
-    <w:p>
-      <w:r>
-        <w:rPr>
-          <w:rFonts w:eastAsia="MS Gothic" w:cs="MS Gothic"/>
-        </w:rPr>
-        <w:t>├</w:t>
-      </w:r>
-      <w:r>
-        <w:rPr>
-          <w:rFonts w:cs="Aptos"/>
-        </w:rPr>
-        <w:t>──</w:t>
-      </w:r>
-      <w:r>
-        <w:t xml:space="preserve"> </w:t>
-      </w:r>
-      <w:proofErr w:type="spellStart"/>
-      <w:r>
-        <w:t>USB_Downstream</w:t>
-      </w:r>
-      <w:proofErr w:type="spellEnd"/>
-      <w:r>
-        <w:t xml:space="preserve"> (Rear)</w:t>
-      </w:r>
-    </w:p>
-    <w:p>
-      <w:r>
-        <w:rPr>
-          <w:rFonts w:eastAsia="MS Gothic" w:cs="MS Gothic"/>
-        </w:rPr>
-        <w:t>├</w:t>
-      </w:r>
-      <w:r>
-        <w:rPr>
-          <w:rFonts w:cs="Aptos"/>
-        </w:rPr>
-        <w:t>──</w:t>
-      </w:r>
-      <w:r>
-        <w:t xml:space="preserve"> </w:t>
-      </w:r>
-      <w:proofErr w:type="spellStart"/>
-      <w:r>
-        <w:t>SD_Reader</w:t>
-      </w:r>
-      <w:proofErr w:type="spellEnd"/>
-    </w:p>
-    <w:p>
-      <w:r>
-        <w:rPr>
-          <w:rFonts w:eastAsia="MS Gothic" w:cs="MS Gothic"/>
-        </w:rPr>
-        <w:t>├</w:t>
-      </w:r>
-      <w:r>
-        <w:rPr>
-          <w:rFonts w:cs="Aptos"/>
-        </w:rPr>
-        <w:t>──</w:t>
-      </w:r>
-      <w:r>
-        <w:t xml:space="preserve"> Fan</w:t>
-      </w:r>
-    </w:p>
-    <w:p>
-      <w:r>
-        <w:rPr>
-          <w:rFonts w:eastAsia="MS Gothic" w:cs="MS Gothic"/>
-        </w:rPr>
-        <w:t>├</w:t>
-      </w:r>
-      <w:r>
-        <w:rPr>
-          <w:rFonts w:cs="Aptos"/>
-        </w:rPr>
-        <w:t>──</w:t>
-      </w:r>
-      <w:r>
         <w:t xml:space="preserve"> MCU</w:t>
       </w:r>
     </w:p>
@@ -3644,14 +3481,14 @@
     <w:p>
       <w:r>
         <w:pict w14:anchorId="295232F9">
-          <v:rect id="_x0000_i1296" style="width:0;height:1.5pt" o:hralign="center" o:hrstd="t" o:hr="t" fillcolor="#a0a0a0" stroked="f"/>
+          <v:rect id="_x0000_i1036" style="width:0;height:1.5pt" o:hralign="center" o:hrstd="t" o:hr="t" fillcolor="#a0a0a0" stroked="f"/>
         </w:pict>
       </w:r>
     </w:p>
     <w:p>
       <w:r>
         <w:pict w14:anchorId="517A4D1A">
-          <v:rect id="_x0000_i1297" style="width:0;height:1.5pt" o:hralign="center" o:hrstd="t" o:hr="t" fillcolor="#a0a0a0" stroked="f"/>
+          <v:rect id="_x0000_i1037" style="width:0;height:1.5pt" o:hralign="center" o:hrstd="t" o:hr="t" fillcolor="#a0a0a0" stroked="f"/>
         </w:pict>
       </w:r>
     </w:p>
@@ -3741,33 +3578,12 @@
     </w:p>
     <w:p>
       <w:r>
-        <w:t xml:space="preserve">                             5V Buck Converter             </w:t>
-      </w:r>
-      <w:proofErr w:type="spellStart"/>
-      <w:r>
-        <w:t>CoreRegs</w:t>
-      </w:r>
-      <w:proofErr w:type="spellEnd"/>
-    </w:p>
-    <w:p>
-      <w:r>
-        <w:t xml:space="preserve">                                (≥10 </w:t>
-      </w:r>
-      <w:proofErr w:type="gramStart"/>
-      <w:r>
-        <w:t xml:space="preserve">A)   </w:t>
-      </w:r>
-      <w:proofErr w:type="gramEnd"/>
-      <w:r>
-        <w:t xml:space="preserve">           </w:t>
-      </w:r>
-      <w:proofErr w:type="gramStart"/>
-      <w:r>
-        <w:t xml:space="preserve">   (</w:t>
-      </w:r>
-      <w:proofErr w:type="gramEnd"/>
-      <w:r>
-        <w:t>3.3 V, etc.)</w:t>
+        <w:t xml:space="preserve">                             5V Buck Converter             CoreRegs</w:t>
+      </w:r>
+    </w:p>
+    <w:p>
+      <w:r>
+        <w:t xml:space="preserve">                                (≥10 A)                 (3.3 V, etc.)</w:t>
       </w:r>
     </w:p>
     <w:p>
@@ -3792,7 +3608,6 @@
     </w:p>
     <w:p>
       <w:r>
-        <w:lastRenderedPageBreak/>
         <w:t xml:space="preserve">     ┌───────────────────────</w:t>
       </w:r>
       <w:r>
@@ -3826,6 +3641,7 @@
     </w:p>
     <w:p>
       <w:r>
+        <w:lastRenderedPageBreak/>
         <w:t xml:space="preserve">     │                       │               │                       │</w:t>
       </w:r>
     </w:p>
@@ -3990,7 +3806,6 @@
         </w:numPr>
       </w:pPr>
       <w:r>
-        <w:lastRenderedPageBreak/>
         <w:t xml:space="preserve">The USB7206's spare downstream capacity is reserved for internal expansion, allowing future revisions to add features without replacing the hub IC. </w:t>
       </w:r>
     </w:p>
@@ -4005,7 +3820,6 @@
       <w:r>
         <w:t xml:space="preserve">The </w:t>
       </w:r>
-      <w:proofErr w:type="spellStart"/>
       <w:r>
         <w:rPr>
           <w:b/>
@@ -4013,7 +3827,6 @@
         </w:rPr>
         <w:t>CoreRegs</w:t>
       </w:r>
-      <w:proofErr w:type="spellEnd"/>
       <w:r>
         <w:t xml:space="preserve"> sheet should provide any auxiliary rails required by the hub, SD controller, and future MCU (for example, 3.3 V or lower-voltage rails if required by the chosen devices). This keeps the power architecture modular and adaptable as component selections are finalised.</w:t>
       </w:r>
@@ -8446,6 +8259,7 @@
   <w:style w:type="character" w:default="1" w:styleId="DefaultParagraphFont">
     <w:name w:val="Default Paragraph Font"/>
     <w:uiPriority w:val="1"/>
+    <w:semiHidden/>
     <w:unhideWhenUsed/>
   </w:style>
   <w:style w:type="table" w:default="1" w:styleId="TableNormal">

</xml_diff>